<commit_message>
hoàn thành dự án quản lý quỷ
</commit_message>
<xml_diff>
--- a/backend/templates/bao-cao/thu_chi_tong_hop.docx
+++ b/backend/templates/bao-cao/thu_chi_tong_hop.docx
@@ -613,6 +613,368 @@
     </w:tbl>
     <w:p>
       <w:pPr>
+        <w:spacing w:after="120" w:before="240"/>
+      </w:pPr>
+      <w:r>
+        <w:rPr>
+          <w:b/>
+          <w:bCs/>
+          <w:color w:val="F0A500"/>
+          <w:sz w:val="24"/>
+          <w:szCs w:val="24"/>
+        </w:rPr>
+        <w:t xml:space="preserve">IV. TĂNG TRƯỞNG NGƯỜI DÙNG MỚI (6 THÁNG GẦN NHẤT)</w:t>
+      </w:r>
+    </w:p>
+    <w:tbl>
+      <w:tblPr>
+        <w:tblW w:type="pct" w:w="100%"/>
+        <w:tblBorders>
+          <w:top w:val="single" w:color="CBD5E1" w:sz="4"/>
+          <w:left w:val="single" w:color="CBD5E1" w:sz="4"/>
+          <w:bottom w:val="single" w:color="CBD5E1" w:sz="4"/>
+          <w:right w:val="single" w:color="CBD5E1" w:sz="4"/>
+          <w:insideH w:val="single" w:color="E2E8F0" w:sz="2"/>
+          <w:insideV w:val="single" w:color="E2E8F0" w:sz="2"/>
+        </w:tblBorders>
+      </w:tblPr>
+      <w:tblGrid>
+        <w:gridCol w:w="100"/>
+        <w:gridCol w:w="100"/>
+        <w:gridCol w:w="100"/>
+      </w:tblGrid>
+      <w:tr>
+        <w:trPr>
+          <w:tblHeader/>
+        </w:trPr>
+        <w:tc>
+          <w:tcPr>
+            <w:tcW w:type="pct" w:w="15%"/>
+            <w:shd w:fill="1A2F5E" w:color="auto" w:val="clear"/>
+          </w:tcPr>
+          <w:p>
+            <w:pPr>
+              <w:jc w:val="center"/>
+            </w:pPr>
+            <w:r>
+              <w:rPr>
+                <w:b/>
+                <w:bCs/>
+                <w:color w:val="FFFFFF"/>
+                <w:sz w:val="22"/>
+                <w:szCs w:val="22"/>
+              </w:rPr>
+              <w:t xml:space="preserve">STT</w:t>
+            </w:r>
+          </w:p>
+        </w:tc>
+        <w:tc>
+          <w:tcPr>
+            <w:tcW w:type="pct" w:w="55%"/>
+            <w:shd w:fill="1A2F5E" w:color="auto" w:val="clear"/>
+          </w:tcPr>
+          <w:p>
+            <w:pPr>
+              <w:jc w:val="center"/>
+            </w:pPr>
+            <w:r>
+              <w:rPr>
+                <w:b/>
+                <w:bCs/>
+                <w:color w:val="FFFFFF"/>
+                <w:sz w:val="22"/>
+                <w:szCs w:val="22"/>
+              </w:rPr>
+              <w:t xml:space="preserve">Kỳ thời gian</w:t>
+            </w:r>
+          </w:p>
+        </w:tc>
+        <w:tc>
+          <w:tcPr>
+            <w:tcW w:type="pct" w:w="30%"/>
+            <w:shd w:fill="1A2F5E" w:color="auto" w:val="clear"/>
+          </w:tcPr>
+          <w:p>
+            <w:pPr>
+              <w:jc w:val="center"/>
+            </w:pPr>
+            <w:r>
+              <w:rPr>
+                <w:b/>
+                <w:bCs/>
+                <w:color w:val="FFFFFF"/>
+                <w:sz w:val="22"/>
+                <w:szCs w:val="22"/>
+              </w:rPr>
+              <w:t xml:space="preserve">Số lượng đăng ký mới</w:t>
+            </w:r>
+          </w:p>
+        </w:tc>
+      </w:tr>
+      <w:tr>
+        <w:tc>
+          <w:p>
+            <w:pPr>
+              <w:jc w:val="center"/>
+            </w:pPr>
+            <w:r>
+              <w:rPr>
+                <w:sz w:val="22"/>
+                <w:szCs w:val="22"/>
+              </w:rPr>
+              <w:t xml:space="preserve">{#user_growth_rows}{stt}</w:t>
+            </w:r>
+          </w:p>
+        </w:tc>
+        <w:tc>
+          <w:p>
+            <w:pPr>
+              <w:jc w:val="left"/>
+            </w:pPr>
+            <w:r>
+              <w:rPr>
+                <w:sz w:val="22"/>
+                <w:szCs w:val="22"/>
+              </w:rPr>
+              <w:t xml:space="preserve">{thang}</w:t>
+            </w:r>
+          </w:p>
+        </w:tc>
+        <w:tc>
+          <w:p>
+            <w:pPr>
+              <w:jc w:val="center"/>
+            </w:pPr>
+            <w:r>
+              <w:rPr>
+                <w:sz w:val="22"/>
+                <w:szCs w:val="22"/>
+              </w:rPr>
+              <w:t xml:space="preserve">{count}{/user_growth_rows}</w:t>
+            </w:r>
+          </w:p>
+        </w:tc>
+      </w:tr>
+    </w:tbl>
+    <w:p>
+      <w:pPr>
+        <w:spacing w:after="120" w:before="240"/>
+      </w:pPr>
+      <w:r>
+        <w:rPr>
+          <w:b/>
+          <w:bCs/>
+          <w:color w:val="F0A500"/>
+          <w:sz w:val="24"/>
+          <w:szCs w:val="24"/>
+        </w:rPr>
+        <w:t xml:space="preserve">V. PHÂN BỔ SỐ DƯ CHI TIẾT CỦA CÁC QUỸ</w:t>
+      </w:r>
+    </w:p>
+    <w:tbl>
+      <w:tblPr>
+        <w:tblW w:type="pct" w:w="100%"/>
+        <w:tblBorders>
+          <w:top w:val="single" w:color="CBD5E1" w:sz="4"/>
+          <w:left w:val="single" w:color="CBD5E1" w:sz="4"/>
+          <w:bottom w:val="single" w:color="CBD5E1" w:sz="4"/>
+          <w:right w:val="single" w:color="CBD5E1" w:sz="4"/>
+          <w:insideH w:val="single" w:color="E2E8F0" w:sz="2"/>
+          <w:insideV w:val="single" w:color="E2E8F0" w:sz="2"/>
+        </w:tblBorders>
+      </w:tblPr>
+      <w:tblGrid>
+        <w:gridCol w:w="100"/>
+        <w:gridCol w:w="100"/>
+        <w:gridCol w:w="100"/>
+        <w:gridCol w:w="100"/>
+        <w:gridCol w:w="100"/>
+      </w:tblGrid>
+      <w:tr>
+        <w:trPr>
+          <w:tblHeader/>
+        </w:trPr>
+        <w:tc>
+          <w:tcPr>
+            <w:tcW w:type="pct" w:w="10%"/>
+            <w:shd w:fill="1A2F5E" w:color="auto" w:val="clear"/>
+          </w:tcPr>
+          <w:p>
+            <w:pPr>
+              <w:jc w:val="center"/>
+            </w:pPr>
+            <w:r>
+              <w:rPr>
+                <w:b/>
+                <w:bCs/>
+                <w:color w:val="FFFFFF"/>
+                <w:sz w:val="22"/>
+                <w:szCs w:val="22"/>
+              </w:rPr>
+              <w:t xml:space="preserve">STT</w:t>
+            </w:r>
+          </w:p>
+        </w:tc>
+        <w:tc>
+          <w:tcPr>
+            <w:tcW w:type="pct" w:w="40%"/>
+            <w:shd w:fill="1A2F5E" w:color="auto" w:val="clear"/>
+          </w:tcPr>
+          <w:p>
+            <w:pPr>
+              <w:jc w:val="center"/>
+            </w:pPr>
+            <w:r>
+              <w:rPr>
+                <w:b/>
+                <w:bCs/>
+                <w:color w:val="FFFFFF"/>
+                <w:sz w:val="22"/>
+                <w:szCs w:val="22"/>
+              </w:rPr>
+              <w:t xml:space="preserve">Tên quỹ</w:t>
+            </w:r>
+          </w:p>
+        </w:tc>
+        <w:tc>
+          <w:tcPr>
+            <w:tcW w:type="pct" w:w="15%"/>
+            <w:shd w:fill="1A2F5E" w:color="auto" w:val="clear"/>
+          </w:tcPr>
+          <w:p>
+            <w:pPr>
+              <w:jc w:val="center"/>
+            </w:pPr>
+            <w:r>
+              <w:rPr>
+                <w:b/>
+                <w:bCs/>
+                <w:color w:val="FFFFFF"/>
+                <w:sz w:val="22"/>
+                <w:szCs w:val="22"/>
+              </w:rPr>
+              <w:t xml:space="preserve">Loại quỹ</w:t>
+            </w:r>
+          </w:p>
+        </w:tc>
+        <w:tc>
+          <w:tcPr>
+            <w:tcW w:type="pct" w:w="20%"/>
+            <w:shd w:fill="1A2F5E" w:color="auto" w:val="clear"/>
+          </w:tcPr>
+          <w:p>
+            <w:pPr>
+              <w:jc w:val="center"/>
+            </w:pPr>
+            <w:r>
+              <w:rPr>
+                <w:b/>
+                <w:bCs/>
+                <w:color w:val="FFFFFF"/>
+                <w:sz w:val="22"/>
+                <w:szCs w:val="22"/>
+              </w:rPr>
+              <w:t xml:space="preserve">Số dư hiện tại</w:t>
+            </w:r>
+          </w:p>
+        </w:tc>
+        <w:tc>
+          <w:tcPr>
+            <w:tcW w:type="pct" w:w="15%"/>
+            <w:shd w:fill="1A2F5E" w:color="auto" w:val="clear"/>
+          </w:tcPr>
+          <w:p>
+            <w:pPr>
+              <w:jc w:val="center"/>
+            </w:pPr>
+            <w:r>
+              <w:rPr>
+                <w:b/>
+                <w:bCs/>
+                <w:color w:val="FFFFFF"/>
+                <w:sz w:val="22"/>
+                <w:szCs w:val="22"/>
+              </w:rPr>
+              <w:t xml:space="preserve">Tỷ lệ chiếm</w:t>
+            </w:r>
+          </w:p>
+        </w:tc>
+      </w:tr>
+      <w:tr>
+        <w:tc>
+          <w:p>
+            <w:pPr>
+              <w:jc w:val="center"/>
+            </w:pPr>
+            <w:r>
+              <w:rPr>
+                <w:sz w:val="22"/>
+                <w:szCs w:val="22"/>
+              </w:rPr>
+              <w:t xml:space="preserve">{#fund_distribution_rows}{stt}</w:t>
+            </w:r>
+          </w:p>
+        </w:tc>
+        <w:tc>
+          <w:p>
+            <w:pPr>
+              <w:jc w:val="left"/>
+            </w:pPr>
+            <w:r>
+              <w:rPr>
+                <w:sz w:val="22"/>
+                <w:szCs w:val="22"/>
+              </w:rPr>
+              <w:t xml:space="preserve">{ten_quy}</w:t>
+            </w:r>
+          </w:p>
+        </w:tc>
+        <w:tc>
+          <w:p>
+            <w:pPr>
+              <w:jc w:val="left"/>
+            </w:pPr>
+            <w:r>
+              <w:rPr>
+                <w:sz w:val="22"/>
+                <w:szCs w:val="22"/>
+              </w:rPr>
+              <w:t xml:space="preserve">{loai_quy}</w:t>
+            </w:r>
+          </w:p>
+        </w:tc>
+        <w:tc>
+          <w:p>
+            <w:pPr>
+              <w:jc w:val="right"/>
+            </w:pPr>
+            <w:r>
+              <w:rPr>
+                <w:sz w:val="22"/>
+                <w:szCs w:val="22"/>
+              </w:rPr>
+              <w:t xml:space="preserve">{so_du}</w:t>
+            </w:r>
+          </w:p>
+        </w:tc>
+        <w:tc>
+          <w:p>
+            <w:pPr>
+              <w:jc w:val="center"/>
+            </w:pPr>
+            <w:r>
+              <w:rPr>
+                <w:sz w:val="22"/>
+                <w:szCs w:val="22"/>
+              </w:rPr>
+              <w:t xml:space="preserve">{ty_le}{/fund_distribution_rows}</w:t>
+            </w:r>
+          </w:p>
+        </w:tc>
+      </w:tr>
+    </w:tbl>
+    <w:p>
+      <w:pPr>
         <w:spacing w:before="400"/>
         <w:jc w:val="left"/>
       </w:pPr>

</xml_diff>